<commit_message>
ADDED CHUNKING DESCISION DELIVERABLE + OTHER TUESDAY WORK
Working in Firm intelligence API
</commit_message>
<xml_diff>
--- a/week-5/Monday questions PM.docx
+++ b/week-5/Monday questions PM.docx
@@ -7,17 +7,18 @@
         <w:rPr>
           <w:sz w:val="28"/>
           <w:szCs w:val="28"/>
+          <w:u w:val="single"/>
         </w:rPr>
       </w:pPr>
       <w:r>
         <w:rPr>
           <w:sz w:val="28"/>
           <w:szCs w:val="28"/>
+          <w:u w:val="single"/>
         </w:rPr>
         <w:t xml:space="preserve">Monday Afternoon questions </w:t>
       </w:r>
     </w:p>
-    <w:p/>
     <w:p/>
     <w:p>
       <w:pPr>
@@ -34,23 +35,7 @@
         <w:t>Is chunking worth it?</w:t>
       </w:r>
       <w:r>
-        <w:t xml:space="preserve"> Compare </w:t>
-      </w:r>
-      <w:proofErr w:type="spellStart"/>
-      <w:r>
-        <w:t>whole_document</w:t>
-      </w:r>
-      <w:proofErr w:type="spellEnd"/>
-      <w:r>
-        <w:t xml:space="preserve"> with your best chunked strategy on MRR and on </w:t>
-      </w:r>
-      <w:proofErr w:type="spellStart"/>
-      <w:r>
-        <w:t>ctx</w:t>
-      </w:r>
-      <w:proofErr w:type="spellEnd"/>
-      <w:r>
-        <w:t xml:space="preserve"> words. </w:t>
+        <w:t xml:space="preserve"> Compare whole_document with your best chunked strategy on MRR and on ctx words. </w:t>
       </w:r>
     </w:p>
     <w:p/>
@@ -65,71 +50,37 @@
         <w:t xml:space="preserve">– MRR in </w:t>
       </w:r>
       <w:r>
-        <w:t xml:space="preserve">the </w:t>
-      </w:r>
-      <w:proofErr w:type="spellStart"/>
-      <w:r>
-        <w:t>section_c</w:t>
-      </w:r>
-      <w:r>
-        <w:t>ontextual</w:t>
-      </w:r>
-      <w:proofErr w:type="spellEnd"/>
+        <w:t>the section_c</w:t>
+      </w:r>
+      <w:r>
+        <w:t xml:space="preserve">ontextual </w:t>
+      </w:r>
+      <w:r>
+        <w:t xml:space="preserve">is higher </w:t>
+      </w:r>
+      <w:r>
+        <w:t xml:space="preserve">  compared to just whole document. </w:t>
+      </w:r>
+      <w:r>
+        <w:t>(0.93 vs 0.8</w:t>
+      </w:r>
+      <w:r>
+        <w:t>4</w:t>
+      </w:r>
+      <w:r>
+        <w:t xml:space="preserve">) </w:t>
+      </w:r>
+      <w:r>
+        <w:t xml:space="preserve">. It is also lower in terms of </w:t>
+      </w:r>
+      <w:r>
+        <w:t xml:space="preserve"> ctx words </w:t>
+      </w:r>
       <w:r>
         <w:t xml:space="preserve"> </w:t>
       </w:r>
       <w:r>
-        <w:t xml:space="preserve">is higher </w:t>
-      </w:r>
-      <w:r>
-        <w:t xml:space="preserve">  compared to just whole document. </w:t>
-      </w:r>
-      <w:r>
-        <w:t>(0.93 vs 0.8</w:t>
-      </w:r>
-      <w:r>
-        <w:t>4</w:t>
-      </w:r>
-      <w:proofErr w:type="gramStart"/>
-      <w:r>
-        <w:t xml:space="preserve">) </w:t>
-      </w:r>
-      <w:r>
-        <w:t>.</w:t>
-      </w:r>
-      <w:proofErr w:type="gramEnd"/>
-      <w:r>
-        <w:t xml:space="preserve"> It is also lower in terms </w:t>
-      </w:r>
-      <w:proofErr w:type="gramStart"/>
-      <w:r>
-        <w:t xml:space="preserve">of </w:t>
-      </w:r>
-      <w:r>
-        <w:t xml:space="preserve"> </w:t>
-      </w:r>
-      <w:proofErr w:type="spellStart"/>
-      <w:r>
-        <w:t>ctx</w:t>
-      </w:r>
-      <w:proofErr w:type="spellEnd"/>
-      <w:proofErr w:type="gramEnd"/>
-      <w:r>
-        <w:t xml:space="preserve"> </w:t>
-      </w:r>
-      <w:proofErr w:type="gramStart"/>
-      <w:r>
-        <w:t xml:space="preserve">words </w:t>
-      </w:r>
-      <w:r>
-        <w:t xml:space="preserve"> </w:t>
-      </w:r>
-      <w:r>
-        <w:t>compared</w:t>
-      </w:r>
-      <w:proofErr w:type="gramEnd"/>
-      <w:r>
-        <w:t xml:space="preserve"> to </w:t>
+        <w:t xml:space="preserve">compared to </w:t>
       </w:r>
       <w:r>
         <w:t xml:space="preserve">just whole document. </w:t>
@@ -199,6 +150,9 @@
       <w:pPr>
         <w:ind w:left="720"/>
       </w:pPr>
+      <w:r>
+        <w:t xml:space="preserve">Hits ceiling at 0.5 -cuts 3 answers in half </w:t>
+      </w:r>
     </w:p>
     <w:p>
       <w:pPr>
@@ -220,33 +174,7 @@
         <w:t>What did the contextual prefix buy?</w:t>
       </w:r>
       <w:r>
-        <w:t xml:space="preserve"> </w:t>
-      </w:r>
-      <w:proofErr w:type="spellStart"/>
-      <w:r>
-        <w:t>sections_plain</w:t>
-      </w:r>
-      <w:proofErr w:type="spellEnd"/>
-      <w:r>
-        <w:t xml:space="preserve"> and </w:t>
-      </w:r>
-      <w:proofErr w:type="spellStart"/>
-      <w:r>
-        <w:t>sections_contextual</w:t>
-      </w:r>
-      <w:proofErr w:type="spellEnd"/>
-      <w:r>
-        <w:t xml:space="preserve"> split identically. Any difference between them is the prefix alone. Open </w:t>
-      </w:r>
-      <w:proofErr w:type="spellStart"/>
-      <w:proofErr w:type="gramStart"/>
-      <w:r>
-        <w:t>retrieval.json</w:t>
-      </w:r>
-      <w:proofErr w:type="spellEnd"/>
-      <w:proofErr w:type="gramEnd"/>
-      <w:r>
-        <w:t xml:space="preserve"> and compare recall@3_by_kind for heading-dependent and title-dependent.</w:t>
+        <w:t xml:space="preserve"> sections_plain and sections_contextual split identically. Any difference between them is the prefix alone. Open retrieval.json and compare recall@3_by_kind for heading-dependent and title-dependent.</w:t>
       </w:r>
     </w:p>
     <w:p>
@@ -304,23 +232,7 @@
         <w:pStyle w:val="ListParagraph"/>
       </w:pPr>
       <w:r>
-        <w:t xml:space="preserve">both </w:t>
-      </w:r>
-      <w:proofErr w:type="spellStart"/>
-      <w:r>
-        <w:t>whole_document</w:t>
-      </w:r>
-      <w:proofErr w:type="spellEnd"/>
-      <w:r>
-        <w:t xml:space="preserve"> and </w:t>
-      </w:r>
-      <w:proofErr w:type="spellStart"/>
-      <w:r>
-        <w:t>sections_contextual</w:t>
-      </w:r>
-      <w:proofErr w:type="spellEnd"/>
-      <w:r>
-        <w:t xml:space="preserve"> missed zero questions</w:t>
+        <w:t>both whole_document and sections_contextual missed zero questions</w:t>
       </w:r>
       <w:r>
         <w:t xml:space="preserve"> as it said None</w:t>
@@ -340,16 +252,14 @@
         <w:t xml:space="preserve"> ("none"), </w:t>
       </w:r>
       <w:r>
-        <w:t xml:space="preserve">This indicates that </w:t>
-      </w:r>
-      <w:proofErr w:type="gramStart"/>
-      <w:r>
-        <w:t xml:space="preserve">there </w:t>
-      </w:r>
-      <w:r>
-        <w:t xml:space="preserve"> are</w:t>
-      </w:r>
-      <w:proofErr w:type="gramEnd"/>
+        <w:t>T</w:t>
+      </w:r>
+      <w:r>
+        <w:t xml:space="preserve">here </w:t>
+      </w:r>
+      <w:r>
+        <w:t>are</w:t>
+      </w:r>
       <w:r>
         <w:t xml:space="preserve"> no questions that failed </w:t>
       </w:r>
@@ -363,6 +273,77 @@
       <w:r>
         <w:t xml:space="preserve"> strategy.</w:t>
       </w:r>
+      <w:r>
+        <w:t xml:space="preserve"> I made an observation that q</w:t>
+      </w:r>
+      <w:r>
+        <w:t>0</w:t>
+      </w:r>
+      <w:r>
+        <w:t>2</w:t>
+      </w:r>
+      <w:r>
+        <w:t xml:space="preserve"> was missed by </w:t>
+      </w:r>
+      <w:r>
+        <w:t xml:space="preserve"> </w:t>
+      </w:r>
+      <w:r>
+        <w:t xml:space="preserve">the </w:t>
+      </w:r>
+      <w:r>
+        <w:t xml:space="preserve">other </w:t>
+      </w:r>
+      <w:r>
+        <w:t>strategies</w:t>
+      </w:r>
+      <w:r>
+        <w:t>,</w:t>
+      </w:r>
+      <w:r>
+        <w:t xml:space="preserve">indicating it </w:t>
+      </w:r>
+      <w:r>
+        <w:t>requires</w:t>
+      </w:r>
+      <w:r>
+        <w:t xml:space="preserve"> a context </w:t>
+      </w:r>
+      <w:r>
+        <w:t>to retrieve relevant doc</w:t>
+      </w:r>
+      <w:r>
+        <w:t xml:space="preserve"> which</w:t>
+      </w:r>
+      <w:r>
+        <w:t xml:space="preserve"> only</w:t>
+      </w:r>
+      <w:r>
+        <w:t xml:space="preserve"> whole doc/</w:t>
+      </w:r>
+      <w:r>
+        <w:t>section_context</w:t>
+      </w:r>
+      <w:r>
+        <w:t>ual was able to do</w:t>
+      </w:r>
+      <w:r>
+        <w:t xml:space="preserve"> but other strategies failed.</w:t>
+      </w:r>
+      <w:r>
+        <w:t xml:space="preserve"> </w:t>
+      </w:r>
+      <w:r>
+        <w:t xml:space="preserve">The prefix might be critical to correct retrieval - </w:t>
+      </w:r>
+      <w:r>
+        <w:t>I looked at its kind in eval_set and it was title dependent.</w:t>
+      </w:r>
+    </w:p>
+    <w:p>
+      <w:pPr>
+        <w:pStyle w:val="ListParagraph"/>
+      </w:pPr>
     </w:p>
     <w:p>
       <w:pPr>
@@ -386,7 +367,6 @@
           <w:b/>
           <w:bCs/>
         </w:rPr>
-        <w:lastRenderedPageBreak/>
         <w:t>The two score columns.</w:t>
       </w:r>
       <w:r>
@@ -395,155 +375,94 @@
     </w:p>
     <w:p>
       <w:r>
-        <w:t xml:space="preserve">The best scores for </w:t>
-      </w:r>
-      <w:proofErr w:type="gramStart"/>
-      <w:r>
-        <w:t>answerable</w:t>
-      </w:r>
-      <w:r>
-        <w:t>(</w:t>
-      </w:r>
-      <w:proofErr w:type="gramEnd"/>
-      <w:r>
-        <w:t xml:space="preserve">66 for sections </w:t>
-      </w:r>
-      <w:proofErr w:type="gramStart"/>
-      <w:r>
-        <w:t>contextual )</w:t>
-      </w:r>
-      <w:proofErr w:type="gramEnd"/>
+        <w:t>The best scores for answerable</w:t>
+      </w:r>
+      <w:r>
+        <w:t xml:space="preserve">(66 for sections contextual ) </w:t>
+      </w:r>
+      <w:r>
+        <w:t xml:space="preserve"> and </w:t>
+      </w:r>
+      <w:r>
+        <w:t xml:space="preserve">the best scores for </w:t>
+      </w:r>
+      <w:r>
+        <w:t>unanswerable</w:t>
+      </w:r>
+      <w:r>
+        <w:t xml:space="preserve">(52) </w:t>
+      </w:r>
       <w:r>
         <w:t xml:space="preserve"> </w:t>
       </w:r>
       <w:r>
-        <w:t xml:space="preserve"> and </w:t>
-      </w:r>
-      <w:r>
-        <w:t xml:space="preserve">the best scores for </w:t>
-      </w:r>
-      <w:proofErr w:type="gramStart"/>
-      <w:r>
-        <w:t>unanswerable</w:t>
-      </w:r>
-      <w:r>
-        <w:t>(</w:t>
-      </w:r>
-      <w:proofErr w:type="gramEnd"/>
-      <w:r>
-        <w:t>52</w:t>
-      </w:r>
-      <w:proofErr w:type="gramStart"/>
-      <w:r>
-        <w:t xml:space="preserve">) </w:t>
+        <w:t>14 difference</w:t>
+      </w:r>
+      <w:r>
+        <w:t>. W</w:t>
+      </w:r>
+      <w:r>
+        <w:t xml:space="preserve">hich </w:t>
+      </w:r>
+      <w:r>
+        <w:t>suggests no</w:t>
       </w:r>
       <w:r>
         <w:t xml:space="preserve"> </w:t>
       </w:r>
       <w:r>
-        <w:t>14</w:t>
-      </w:r>
-      <w:proofErr w:type="gramEnd"/>
-      <w:r>
-        <w:t xml:space="preserve"> difference</w:t>
-      </w:r>
-      <w:r>
-        <w:t>. W</w:t>
-      </w:r>
-      <w:r>
-        <w:t xml:space="preserve">hich </w:t>
-      </w:r>
-      <w:r>
-        <w:t>suggests no</w:t>
+        <w:t xml:space="preserve">clean </w:t>
+      </w:r>
+      <w:r>
+        <w:t>separation.</w:t>
       </w:r>
       <w:r>
         <w:t xml:space="preserve"> </w:t>
       </w:r>
       <w:r>
-        <w:t xml:space="preserve">clean </w:t>
-      </w:r>
-      <w:r>
-        <w:t>separation.</w:t>
+        <w:t xml:space="preserve">Overlap </w:t>
+      </w:r>
+      <w:r>
+        <w:t xml:space="preserve">fixed had - </w:t>
+      </w:r>
+      <w:r>
+        <w:t>0.1</w:t>
+      </w:r>
+      <w:r>
+        <w:t xml:space="preserve">1 difference between answerable score and unanswerable score </w:t>
+      </w:r>
+    </w:p>
+    <w:p>
+      <w:r>
+        <w:br/>
+      </w:r>
+      <w:r>
+        <w:br/>
+        <w:t>Choose a shortlist of your two best chunked strategies for Step 7, and keep whole_document as the baseline.</w:t>
+      </w:r>
+    </w:p>
+    <w:p/>
+    <w:p>
+      <w:r>
+        <w:t>Sections contextual</w:t>
+      </w:r>
+      <w:r>
+        <w:t xml:space="preserve"> it has </w:t>
       </w:r>
       <w:r>
         <w:t xml:space="preserve"> </w:t>
       </w:r>
       <w:r>
-        <w:t xml:space="preserve">Overlap </w:t>
-      </w:r>
-      <w:r>
-        <w:t xml:space="preserve">fixed had - </w:t>
-      </w:r>
-      <w:r>
-        <w:t>0.1</w:t>
-      </w:r>
-      <w:r>
-        <w:t xml:space="preserve">1 difference between answerable score and unanswerable score </w:t>
-      </w:r>
-    </w:p>
-    <w:p>
-      <w:r>
-        <w:br/>
-      </w:r>
-      <w:r>
-        <w:br/>
-        <w:t xml:space="preserve">Choose a shortlist of your two best chunked strategies for Step </w:t>
-      </w:r>
-      <w:proofErr w:type="gramStart"/>
-      <w:r>
-        <w:t>7, and</w:t>
-      </w:r>
-      <w:proofErr w:type="gramEnd"/>
-      <w:r>
-        <w:t xml:space="preserve"> keep </w:t>
-      </w:r>
-      <w:proofErr w:type="spellStart"/>
-      <w:r>
-        <w:t>whole_document</w:t>
-      </w:r>
-      <w:proofErr w:type="spellEnd"/>
-      <w:r>
-        <w:t xml:space="preserve"> as the baseline.</w:t>
-      </w:r>
-    </w:p>
-    <w:p/>
-    <w:p>
-      <w:r>
-        <w:t>Sections contextual</w:t>
-      </w:r>
-      <w:r>
-        <w:t xml:space="preserve"> it has </w:t>
-      </w:r>
-      <w:r>
-        <w:t xml:space="preserve"> </w:t>
-      </w:r>
-      <w:r>
-        <w:t xml:space="preserve"> Highest IR@1 </w:t>
-      </w:r>
-      <w:proofErr w:type="gramStart"/>
-      <w:r>
-        <w:t xml:space="preserve">( </w:t>
+        <w:t xml:space="preserve"> Highest IR@1 ( </w:t>
       </w:r>
       <w:r>
         <w:t>0.</w:t>
       </w:r>
       <w:r>
-        <w:t>86</w:t>
-      </w:r>
-      <w:proofErr w:type="gramEnd"/>
-      <w:r>
-        <w:t>) + Highest MRR (</w:t>
-      </w:r>
-      <w:r>
-        <w:t xml:space="preserve">0.93) compared to </w:t>
-      </w:r>
-      <w:proofErr w:type="spellStart"/>
-      <w:r>
-        <w:t>basline</w:t>
-      </w:r>
-      <w:proofErr w:type="spellEnd"/>
-      <w:r>
-        <w:t xml:space="preserve"> whole document</w:t>
+        <w:t>86) + Highest MRR (</w:t>
+      </w:r>
+      <w:r>
+        <w:t>0.93) compared to basline whole document</w:t>
       </w:r>
     </w:p>
     <w:p>

</xml_diff>